<commit_message>
Crear un diccionario en Python v3
</commit_message>
<xml_diff>
--- a/documentos/practica 29 de sep.docx
+++ b/documentos/practica 29 de sep.docx
@@ -202,7 +202,10 @@
         <w:pBdr/>
         <w:spacing/>
         <w:ind/>
-        <w:rPr/>
+        <w:rPr>
+          <w:highlight w:val="none"/>
+          <w:lang w:val="es-MX"/>
+        </w:rPr>
       </w:pPr>
       <w:r>
         <w:rPr>
@@ -220,14 +223,262 @@
         </w:rPr>
         <w:t xml:space="preserve"> es Null</w:t>
       </w:r>
+      <w:r/>
+    </w:p>
+    <w:p>
+      <w:pPr>
+        <w:pBdr/>
+        <w:spacing/>
+        <w:ind/>
+        <w:rPr>
+          <w:b/>
+          <w:bCs/>
+        </w:rPr>
+      </w:pPr>
       <w:r>
         <w:rPr>
+          <w:b/>
+          <w:bCs/>
           <w:highlight w:val="none"/>
           <w:lang w:val="es-MX"/>
         </w:rPr>
       </w:r>
       <w:r>
         <w:rPr>
+          <w:b/>
+          <w:bCs/>
+        </w:rPr>
+        <w:t xml:space="preserve">3. ¿Qué errores de sintaxis impiden que este JSON sea válido según los estándares de red y programación? </w:t>
+      </w:r>
+      <w:r>
+        <w:rPr>
+          <w:b/>
+          <w:bCs/>
+        </w:rPr>
+      </w:r>
+    </w:p>
+    <w:p>
+      <w:pPr>
+        <w:pBdr/>
+        <w:spacing/>
+        <w:ind/>
+        <w:rPr/>
+      </w:pPr>
+      <w:r>
+        <w:t xml:space="preserve">Selecciona las dos opciones correctas.</w:t>
+      </w:r>
+      <w:r/>
+    </w:p>
+    <w:p>
+      <w:pPr>
+        <w:pBdr/>
+        <w:spacing/>
+        <w:ind/>
+        <w:rPr/>
+      </w:pPr>
+      <w:r>
+        <w:t xml:space="preserve">A) El valor de 'vlan_id' debería estar entre comillas dobles obligatoriamente. </w:t>
+      </w:r>
+      <w:r/>
+    </w:p>
+    <w:p>
+      <w:pPr>
+        <w:pBdr/>
+        <w:spacing/>
+        <w:ind/>
+        <w:rPr/>
+      </w:pPr>
+      <w:r>
+        <w:t xml:space="preserve">B) Las claves como 'vlan_id' no d</w:t>
+      </w:r>
+      <w:r>
+        <w:t xml:space="preserve">eben llevar guiones bajos. </w:t>
+      </w:r>
+      <w:r/>
+    </w:p>
+    <w:p>
+      <w:pPr>
+        <w:pBdr/>
+        <w:spacing/>
+        <w:ind/>
+        <w:rPr>
+          <w:highlight w:val="yellow"/>
+        </w:rPr>
+      </w:pPr>
+      <w:r>
+        <w:rPr>
+          <w:highlight w:val="yellow"/>
+        </w:rPr>
+        <w:t xml:space="preserve">C) Existe una coma final (trailing comma) después del valor de 'description'. </w:t>
+      </w:r>
+      <w:r>
+        <w:rPr>
+          <w:highlight w:val="yellow"/>
+        </w:rPr>
+      </w:r>
+    </w:p>
+    <w:p>
+      <w:pPr>
+        <w:pBdr/>
+        <w:spacing/>
+        <w:ind/>
+        <w:rPr>
+          <w:highlight w:val="yellow"/>
+        </w:rPr>
+      </w:pPr>
+      <w:r>
+        <w:rPr>
+          <w:highlight w:val="yellow"/>
+        </w:rPr>
+        <w:t xml:space="preserve">D) Faltan comas para separar los pares clave-valor después de 'vlan_id' y 'name'. </w:t>
+      </w:r>
+      <w:r>
+        <w:rPr>
+          <w:highlight w:val="yellow"/>
+        </w:rPr>
+      </w:r>
+      <w:r>
+        <w:rPr>
+          <w:highlight w:val="yellow"/>
+        </w:rPr>
+      </w:r>
+      <w:r/>
+      <w:r/>
+      <w:r/>
+      <w:r>
+        <w:rPr>
+          <w:highlight w:val="yellow"/>
+        </w:rPr>
+      </w:r>
+    </w:p>
+    <w:p>
+      <w:pPr>
+        <w:pBdr/>
+        <w:spacing/>
+        <w:ind/>
+        <w:rPr>
+          <w:b/>
+          <w:bCs/>
+        </w:rPr>
+      </w:pPr>
+      <w:r>
+        <w:rPr>
+          <w:b/>
+          <w:bCs/>
+        </w:rPr>
+      </w:r>
+      <w:r>
+        <w:rPr>
+          <w:b/>
+          <w:bCs/>
+        </w:rPr>
+        <w:t xml:space="preserve">4. Reflexión Técnica: Explica por qué es crítico que un controlador como Cisco DNA Center reciba un JSON perfectamente validado antes de aplicar cambios en la red. </w:t>
+      </w:r>
+      <w:r>
+        <w:rPr>
+          <w:b/>
+          <w:bCs/>
+        </w:rPr>
+      </w:r>
+      <w:r>
+        <w:rPr>
+          <w:b/>
+          <w:bCs/>
+        </w:rPr>
+      </w:r>
+    </w:p>
+    <w:p>
+      <w:pPr>
+        <w:pBdr/>
+        <w:spacing/>
+        <w:ind/>
+        <w:rPr>
+          <w:highlight w:val="none"/>
+          <w:lang w:val="es-MX"/>
+        </w:rPr>
+      </w:pPr>
+      <w:r/>
+      <w:r>
+        <w:rPr>
+          <w:lang w:val="es-MX"/>
+        </w:rPr>
+        <w:t xml:space="preserve">Porque puede que a mitad de la ejecución falle a la mitad del proceso y que los dispositivos en un estado enifieciente provocando caidas en el trafico de la red</w:t>
+      </w:r>
+      <w:r/>
+    </w:p>
+    <w:p>
+      <w:pPr>
+        <w:pBdr/>
+        <w:spacing/>
+        <w:ind/>
+        <w:rPr/>
+      </w:pPr>
+      <w:r/>
+      <w:r/>
+      <w:r/>
+    </w:p>
+    <w:p>
+      <w:pPr>
+        <w:pBdr/>
+        <w:spacing/>
+        <w:ind/>
+        <w:rPr>
+          <w:b/>
+          <w:bCs/>
+        </w:rPr>
+      </w:pPr>
+      <w:r>
+        <w:rPr>
+          <w:b/>
+          <w:bCs/>
+          <w:lang w:val="es-MX"/>
+        </w:rPr>
+        <w:t xml:space="preserve">Actividad 2</w:t>
+      </w:r>
+      <w:r>
+        <w:rPr>
+          <w:b/>
+          <w:bCs/>
+        </w:rPr>
+      </w:r>
+    </w:p>
+    <w:p>
+      <w:pPr>
+        <w:pBdr/>
+        <w:spacing/>
+        <w:ind/>
+        <w:rPr>
+          <w:b/>
+          <w:bCs/>
+        </w:rPr>
+      </w:pPr>
+      <w:r>
+        <w:rPr>
+          <w:b/>
+          <w:bCs/>
+          <w:highlight w:val="none"/>
+          <w:lang w:val="es-MX"/>
+        </w:rPr>
+      </w:r>
+      <w:r>
+        <w:rPr>
+          <w:b/>
+          <w:bCs/>
+        </w:rPr>
+        <w:t xml:space="preserve">1. Escribe el pseudocódigo o completa el script de Python necesario para procesar la variable inventario_json (que contiene el texto anterior). El script debe filtrar e imprimir únicamente los hostnames de los dispositivos cuyo estado sea 'down'</w:t>
+      </w:r>
+      <w:r>
+        <w:rPr>
+          <w:b/>
+          <w:bCs/>
+          <w:highlight w:val="none"/>
+          <w:lang w:val="es-MX"/>
+        </w:rPr>
+      </w:r>
+      <w:r>
+        <w:rPr>
+          <w:b/>
+          <w:bCs/>
           <w:highlight w:val="none"/>
           <w:lang w:val="es-MX"/>
         </w:rPr>
@@ -240,6 +491,59 @@
         <w:ind/>
         <w:rPr/>
       </w:pPr>
+      <w:r>
+        <w:rPr>
+          <w:highlight w:val="none"/>
+        </w:rPr>
+        <w:t xml:space="preserve">for d in inventario:</w:t>
+      </w:r>
+      <w:r/>
+    </w:p>
+    <w:p>
+      <w:pPr>
+        <w:pBdr/>
+        <w:spacing/>
+        <w:ind/>
+        <w:rPr/>
+      </w:pPr>
+      <w:r>
+        <w:rPr>
+          <w:highlight w:val="none"/>
+        </w:rPr>
+        <w:t xml:space="preserve">    if d["status"] == "down":</w:t>
+      </w:r>
+      <w:r/>
+    </w:p>
+    <w:p>
+      <w:pPr>
+        <w:pBdr/>
+        <w:spacing/>
+        <w:ind/>
+        <w:rPr>
+          <w:highlight w:val="none"/>
+        </w:rPr>
+      </w:pPr>
+      <w:r>
+        <w:rPr>
+          <w:highlight w:val="none"/>
+        </w:rPr>
+        <w:t xml:space="preserve">        print(d["hostname"])</w:t>
+      </w:r>
+      <w:r/>
+      <w:r>
+        <w:rPr>
+          <w:highlight w:val="none"/>
+        </w:rPr>
+      </w:r>
+      <w:r/>
+    </w:p>
+    <w:p>
+      <w:pPr>
+        <w:pBdr/>
+        <w:spacing/>
+        <w:ind/>
+        <w:rPr/>
+      </w:pPr>
       <w:r/>
       <w:r/>
       <w:r/>
@@ -266,6 +570,478 @@
       <w:r/>
       <w:r/>
     </w:p>
+    <w:p>
+      <w:pPr>
+        <w:pBdr/>
+        <w:spacing/>
+        <w:ind/>
+        <w:rPr/>
+      </w:pPr>
+      <w:r/>
+      <w:r/>
+      <w:r/>
+    </w:p>
+    <w:p>
+      <w:pPr>
+        <w:pBdr/>
+        <w:spacing/>
+        <w:ind/>
+        <w:rPr/>
+      </w:pPr>
+      <w:r/>
+      <w:r>
+        <w:t xml:space="preserve">Comparativa de Formatos (JSON vs. XML)</w:t>
+      </w:r>
+      <w:r/>
+      <w:r/>
+    </w:p>
+    <w:tbl>
+      <w:tblPr>
+        <w:tblStyle w:val="12"/>
+        <w:tblW w:w="0" w:type="auto"/>
+        <w:tblBorders/>
+        <w:tblLook w:val="04A0" w:firstRow="1" w:lastRow="0" w:firstColumn="1" w:lastColumn="0" w:noHBand="0" w:noVBand="1"/>
+      </w:tblPr>
+      <w:tblGrid>
+        <w:gridCol w:w="4677"/>
+        <w:gridCol w:w="4677"/>
+      </w:tblGrid>
+      <w:tr>
+        <w:trPr/>
+        <w:tc>
+          <w:tcPr>
+            <w:tcBorders/>
+            <w:tcW w:w="4677" w:type="dxa"/>
+          </w:tcPr>
+          <w:p>
+            <w:pPr>
+              <w:pBdr/>
+              <w:spacing/>
+              <w:ind/>
+              <w:rPr>
+                <w:b/>
+                <w:bCs/>
+                <w:highlight w:val="none"/>
+              </w:rPr>
+            </w:pPr>
+            <w:r>
+              <w:rPr>
+                <w:b/>
+                <w:bCs/>
+                <w:highlight w:val="none"/>
+                <w:lang w:val="es-MX"/>
+              </w:rPr>
+              <w:t xml:space="preserve">JSON</w:t>
+            </w:r>
+            <w:r>
+              <w:rPr>
+                <w:b/>
+                <w:bCs/>
+                <w:highlight w:val="none"/>
+              </w:rPr>
+            </w:r>
+          </w:p>
+        </w:tc>
+        <w:tc>
+          <w:tcPr>
+            <w:tcBorders/>
+            <w:tcW w:w="4677" w:type="dxa"/>
+          </w:tcPr>
+          <w:p>
+            <w:pPr>
+              <w:pBdr/>
+              <w:spacing/>
+              <w:ind/>
+              <w:rPr>
+                <w:b/>
+                <w:bCs/>
+                <w:highlight w:val="none"/>
+              </w:rPr>
+            </w:pPr>
+            <w:r>
+              <w:rPr>
+                <w:b/>
+                <w:bCs/>
+                <w:highlight w:val="none"/>
+                <w:lang w:val="es-MX"/>
+              </w:rPr>
+              <w:t xml:space="preserve">XML</w:t>
+            </w:r>
+            <w:r>
+              <w:rPr>
+                <w:b/>
+                <w:bCs/>
+                <w:highlight w:val="none"/>
+              </w:rPr>
+            </w:r>
+          </w:p>
+        </w:tc>
+      </w:tr>
+      <w:tr>
+        <w:trPr/>
+        <w:tc>
+          <w:tcPr>
+            <w:tcBorders/>
+            <w:tcW w:w="4677" w:type="dxa"/>
+          </w:tcPr>
+          <w:p>
+            <w:pPr>
+              <w:pBdr/>
+              <w:spacing/>
+              <w:ind/>
+              <w:rPr>
+                <w:highlight w:val="none"/>
+              </w:rPr>
+            </w:pPr>
+            <w:r>
+              <w:rPr>
+                <w:highlight w:val="none"/>
+              </w:rPr>
+            </w:r>
+            <w:r>
+              <w:t xml:space="preserve">Usa una sintaxis breve basada en objetos {} y arreglos []</w:t>
+            </w:r>
+            <w:r>
+              <w:rPr>
+                <w:highlight w:val="none"/>
+              </w:rPr>
+            </w:r>
+            <w:r>
+              <w:rPr>
+                <w:highlight w:val="none"/>
+              </w:rPr>
+            </w:r>
+          </w:p>
+        </w:tc>
+        <w:tc>
+          <w:tcPr>
+            <w:tcBorders/>
+            <w:tcW w:w="4677" w:type="dxa"/>
+          </w:tcPr>
+          <w:p>
+            <w:pPr>
+              <w:pBdr/>
+              <w:spacing/>
+              <w:ind/>
+              <w:rPr>
+                <w:highlight w:val="none"/>
+              </w:rPr>
+            </w:pPr>
+            <w:r>
+              <w:rPr>
+                <w:highlight w:val="none"/>
+              </w:rPr>
+            </w:r>
+            <w:r>
+              <w:rPr>
+                <w:highlight w:val="none"/>
+              </w:rPr>
+              <w:t xml:space="preserve">Usa etiquetas de apertura y cierre</w:t>
+            </w:r>
+            <w:r>
+              <w:rPr>
+                <w:highlight w:val="none"/>
+              </w:rPr>
+            </w:r>
+            <w:r>
+              <w:rPr>
+                <w:highlight w:val="none"/>
+              </w:rPr>
+            </w:r>
+          </w:p>
+        </w:tc>
+      </w:tr>
+      <w:tr>
+        <w:trPr/>
+        <w:tc>
+          <w:tcPr>
+            <w:tcBorders/>
+            <w:tcW w:w="4677" w:type="dxa"/>
+          </w:tcPr>
+          <w:p>
+            <w:pPr>
+              <w:pBdr/>
+              <w:spacing/>
+              <w:ind/>
+              <w:rPr>
+                <w:highlight w:val="none"/>
+              </w:rPr>
+            </w:pPr>
+            <w:r>
+              <w:rPr>
+                <w:highlight w:val="none"/>
+              </w:rPr>
+            </w:r>
+            <w:r>
+              <w:t xml:space="preserve">No admite comentarios en el estándar JSON</w:t>
+            </w:r>
+            <w:r>
+              <w:rPr>
+                <w:highlight w:val="none"/>
+              </w:rPr>
+            </w:r>
+            <w:r>
+              <w:rPr>
+                <w:highlight w:val="none"/>
+              </w:rPr>
+            </w:r>
+          </w:p>
+        </w:tc>
+        <w:tc>
+          <w:tcPr>
+            <w:tcBorders/>
+            <w:tcW w:w="4677" w:type="dxa"/>
+          </w:tcPr>
+          <w:p>
+            <w:pPr>
+              <w:pBdr/>
+              <w:spacing/>
+              <w:ind/>
+              <w:rPr>
+                <w:highlight w:val="none"/>
+              </w:rPr>
+            </w:pPr>
+            <w:r>
+              <w:rPr>
+                <w:highlight w:val="none"/>
+              </w:rPr>
+            </w:r>
+            <w:r>
+              <w:rPr>
+                <w:highlight w:val="none"/>
+              </w:rPr>
+              <w:t xml:space="preserve">Organiza los datos en una estructura jerárquica o de árbol</w:t>
+            </w:r>
+            <w:r>
+              <w:rPr>
+                <w:highlight w:val="none"/>
+              </w:rPr>
+            </w:r>
+            <w:r>
+              <w:rPr>
+                <w:highlight w:val="none"/>
+              </w:rPr>
+            </w:r>
+          </w:p>
+        </w:tc>
+      </w:tr>
+      <w:tr>
+        <w:trPr/>
+        <w:tc>
+          <w:tcPr>
+            <w:tcBorders/>
+            <w:tcW w:w="4677" w:type="dxa"/>
+          </w:tcPr>
+          <w:p>
+            <w:pPr>
+              <w:pBdr/>
+              <w:spacing/>
+              <w:ind/>
+              <w:rPr>
+                <w:highlight w:val="none"/>
+              </w:rPr>
+            </w:pPr>
+            <w:r>
+              <w:rPr>
+                <w:highlight w:val="none"/>
+              </w:rPr>
+            </w:r>
+            <w:r>
+              <w:t xml:space="preserve">No usa atributos ni espacios de nombres</w:t>
+            </w:r>
+            <w:r>
+              <w:rPr>
+                <w:highlight w:val="none"/>
+              </w:rPr>
+            </w:r>
+            <w:r>
+              <w:rPr>
+                <w:highlight w:val="none"/>
+              </w:rPr>
+            </w:r>
+          </w:p>
+        </w:tc>
+        <w:tc>
+          <w:tcPr>
+            <w:tcBorders/>
+            <w:tcW w:w="4677" w:type="dxa"/>
+          </w:tcPr>
+          <w:p>
+            <w:pPr>
+              <w:pBdr/>
+              <w:spacing/>
+              <w:ind/>
+              <w:rPr>
+                <w:highlight w:val="none"/>
+              </w:rPr>
+            </w:pPr>
+            <w:r>
+              <w:rPr>
+                <w:highlight w:val="none"/>
+              </w:rPr>
+            </w:r>
+            <w:r>
+              <w:rPr>
+                <w:highlight w:val="none"/>
+              </w:rPr>
+              <w:t xml:space="preserve">Permite crear etiquetas personalizadas según las necesidades del sistema</w:t>
+            </w:r>
+            <w:r>
+              <w:rPr>
+                <w:highlight w:val="none"/>
+              </w:rPr>
+            </w:r>
+            <w:r>
+              <w:rPr>
+                <w:highlight w:val="none"/>
+              </w:rPr>
+            </w:r>
+          </w:p>
+        </w:tc>
+      </w:tr>
+      <w:tr>
+        <w:trPr/>
+        <w:tc>
+          <w:tcPr>
+            <w:tcBorders/>
+            <w:tcW w:w="4677" w:type="dxa"/>
+          </w:tcPr>
+          <w:p>
+            <w:pPr>
+              <w:pBdr/>
+              <w:spacing/>
+              <w:ind/>
+              <w:rPr/>
+            </w:pPr>
+            <w:r>
+              <w:rPr>
+                <w:highlight w:val="none"/>
+              </w:rPr>
+              <w:t xml:space="preserve">Es muy habitual en APIs REST, aplicaciones web y aplicaciones móviles.</w:t>
+            </w:r>
+            <w:r>
+              <w:rPr>
+                <w:highlight w:val="none"/>
+              </w:rPr>
+            </w:r>
+          </w:p>
+        </w:tc>
+        <w:tc>
+          <w:tcPr>
+            <w:tcBorders/>
+            <w:tcW w:w="4677" w:type="dxa"/>
+          </w:tcPr>
+          <w:p>
+            <w:pPr>
+              <w:pBdr/>
+              <w:spacing/>
+              <w:ind/>
+              <w:rPr>
+                <w:highlight w:val="none"/>
+              </w:rPr>
+            </w:pPr>
+            <w:r>
+              <w:rPr>
+                <w:highlight w:val="none"/>
+              </w:rPr>
+            </w:r>
+            <w:r>
+              <w:rPr>
+                <w:highlight w:val="none"/>
+              </w:rPr>
+              <w:t xml:space="preserve">Puede utilizar atributos, como &lt;usuario id="25"&gt;</w:t>
+            </w:r>
+            <w:r>
+              <w:rPr>
+                <w:highlight w:val="none"/>
+              </w:rPr>
+            </w:r>
+            <w:r>
+              <w:rPr>
+                <w:highlight w:val="none"/>
+              </w:rPr>
+            </w:r>
+          </w:p>
+        </w:tc>
+      </w:tr>
+      <w:tr>
+        <w:trPr/>
+        <w:tc>
+          <w:tcPr>
+            <w:tcBorders/>
+            <w:tcW w:w="4677" w:type="dxa"/>
+          </w:tcPr>
+          <w:p>
+            <w:pPr>
+              <w:pBdr/>
+              <w:spacing/>
+              <w:ind/>
+              <w:rPr>
+                <w:highlight w:val="none"/>
+              </w:rPr>
+            </w:pPr>
+            <w:r>
+              <w:rPr>
+                <w:highlight w:val="none"/>
+              </w:rPr>
+            </w:r>
+            <w:r>
+              <w:rPr>
+                <w:highlight w:val="none"/>
+              </w:rPr>
+              <w:t xml:space="preserve">Representa información mediante pares clave–valor</w:t>
+            </w:r>
+            <w:r>
+              <w:rPr>
+                <w:highlight w:val="none"/>
+              </w:rPr>
+            </w:r>
+            <w:r>
+              <w:rPr>
+                <w:highlight w:val="none"/>
+              </w:rPr>
+            </w:r>
+          </w:p>
+        </w:tc>
+        <w:tc>
+          <w:tcPr>
+            <w:tcBorders/>
+            <w:tcW w:w="4677" w:type="dxa"/>
+          </w:tcPr>
+          <w:p>
+            <w:pPr>
+              <w:pBdr/>
+              <w:spacing/>
+              <w:ind/>
+              <w:rPr>
+                <w:highlight w:val="none"/>
+              </w:rPr>
+            </w:pPr>
+            <w:r>
+              <w:rPr>
+                <w:highlight w:val="none"/>
+              </w:rPr>
+            </w:r>
+            <w:r>
+              <w:rPr>
+                <w:highlight w:val="none"/>
+              </w:rPr>
+              <w:t xml:space="preserve">Puede validarse formalmente con tecnologías como DTD o XSD</w:t>
+            </w:r>
+            <w:r>
+              <w:rPr>
+                <w:highlight w:val="none"/>
+              </w:rPr>
+            </w:r>
+            <w:r>
+              <w:rPr>
+                <w:highlight w:val="none"/>
+              </w:rPr>
+            </w:r>
+          </w:p>
+        </w:tc>
+      </w:tr>
+    </w:tbl>
     <w:p>
       <w:pPr>
         <w:pBdr/>

</xml_diff>